<commit_message>
Fixed Errors in Asg3 PDF
</commit_message>
<xml_diff>
--- a/Assignment03/docs/asg3.docx
+++ b/Assignment03/docs/asg3.docx
@@ -65,31 +65,23 @@
           <w:b/>
           <w:bCs/>
         </w:rPr>
-        <w:t xml:space="preserve">Step 1: </w:t>
-      </w:r>
-      <w:r>
+        <w:t>Step 1: Write a grammar in EBNF format that defines the parsing rules for this command. Identify the tokens, variables, and start symbol for this grammar.   Define examples for each of the five supported commands and draw an AST that would be generated from your grammar. </w:t>
+      </w:r>
+    </w:p>
+    <w:p>
+      <w:pPr>
         <w:rPr>
           <w:rFonts w:ascii="Consolas" w:hAnsi="Consolas"/>
           <w:b/>
           <w:bCs/>
         </w:rPr>
-        <w:t>Write a grammar in EBNF format that defines the parsing rules for this command. Identify the tokens, variables, and start symbol for this grammar.   Define examples for each of the five supported commands and draw an AST that would be generated from your grammar. </w:t>
-      </w:r>
-    </w:p>
-    <w:p>
-      <w:pPr>
+      </w:pPr>
+      <w:r>
         <w:rPr>
           <w:rFonts w:ascii="Consolas" w:hAnsi="Consolas"/>
           <w:b/>
           <w:bCs/>
         </w:rPr>
-      </w:pPr>
-      <w:r>
-        <w:rPr>
-          <w:rFonts w:ascii="Consolas" w:hAnsi="Consolas"/>
-          <w:b/>
-          <w:bCs/>
-        </w:rPr>
         <w:t>Part 1: Grammar:</w:t>
       </w:r>
     </w:p>
@@ -131,7 +123,77 @@
           <w:sz w:val="20"/>
           <w:szCs w:val="20"/>
         </w:rPr>
-        <w:t>= ls_command | cd_comand | cat_command | print_command |</w:t>
+        <w:t xml:space="preserve">= </w:t>
+      </w:r>
+      <w:proofErr w:type="spellStart"/>
+      <w:r>
+        <w:rPr>
+          <w:rFonts w:ascii="Consolas" w:hAnsi="Consolas"/>
+          <w:sz w:val="20"/>
+          <w:szCs w:val="20"/>
+        </w:rPr>
+        <w:t>ls_command</w:t>
+      </w:r>
+      <w:proofErr w:type="spellEnd"/>
+      <w:r>
+        <w:rPr>
+          <w:rFonts w:ascii="Consolas" w:hAnsi="Consolas"/>
+          <w:sz w:val="20"/>
+          <w:szCs w:val="20"/>
+        </w:rPr>
+        <w:t xml:space="preserve"> | </w:t>
+      </w:r>
+      <w:proofErr w:type="spellStart"/>
+      <w:r>
+        <w:rPr>
+          <w:rFonts w:ascii="Consolas" w:hAnsi="Consolas"/>
+          <w:sz w:val="20"/>
+          <w:szCs w:val="20"/>
+        </w:rPr>
+        <w:t>cd_com</w:t>
+      </w:r>
+      <w:r>
+        <w:rPr>
+          <w:rFonts w:ascii="Consolas" w:hAnsi="Consolas"/>
+          <w:sz w:val="20"/>
+          <w:szCs w:val="20"/>
+        </w:rPr>
+        <w:t>m</w:t>
+      </w:r>
+      <w:r>
+        <w:rPr>
+          <w:rFonts w:ascii="Consolas" w:hAnsi="Consolas"/>
+          <w:sz w:val="20"/>
+          <w:szCs w:val="20"/>
+        </w:rPr>
+        <w:t>and</w:t>
+      </w:r>
+      <w:proofErr w:type="spellEnd"/>
+      <w:r>
+        <w:rPr>
+          <w:rFonts w:ascii="Consolas" w:hAnsi="Consolas"/>
+          <w:sz w:val="20"/>
+          <w:szCs w:val="20"/>
+        </w:rPr>
+        <w:t xml:space="preserve"> | </w:t>
+      </w:r>
+      <w:proofErr w:type="spellStart"/>
+      <w:r>
+        <w:rPr>
+          <w:rFonts w:ascii="Consolas" w:hAnsi="Consolas"/>
+          <w:sz w:val="20"/>
+          <w:szCs w:val="20"/>
+        </w:rPr>
+        <w:t>cat_command</w:t>
+      </w:r>
+      <w:proofErr w:type="spellEnd"/>
+      <w:r>
+        <w:rPr>
+          <w:rFonts w:ascii="Consolas" w:hAnsi="Consolas"/>
+          <w:sz w:val="20"/>
+          <w:szCs w:val="20"/>
+        </w:rPr>
+        <w:t xml:space="preserve"> | print_command |</w:t>
       </w:r>
       <w:r>
         <w:rPr>
@@ -510,38 +572,39 @@
           <w:sz w:val="20"/>
           <w:szCs w:val="20"/>
         </w:rPr>
-        <w:t xml:space="preserve">upper_case = "A" | "B" | "C" | </w:t>
-      </w:r>
-      <w:r>
-        <w:rPr>
-          <w:rFonts w:ascii="Consolas" w:hAnsi="Consolas"/>
-          <w:sz w:val="20"/>
-          <w:szCs w:val="20"/>
-        </w:rPr>
-        <w:t>"</w:t>
-      </w:r>
-      <w:r>
-        <w:rPr>
-          <w:rFonts w:ascii="Consolas" w:hAnsi="Consolas"/>
-          <w:sz w:val="20"/>
-          <w:szCs w:val="20"/>
-        </w:rPr>
-        <w:t>D</w:t>
-      </w:r>
-      <w:r>
-        <w:rPr>
-          <w:rFonts w:ascii="Consolas" w:hAnsi="Consolas"/>
-          <w:sz w:val="20"/>
-          <w:szCs w:val="20"/>
-        </w:rPr>
-        <w:t>"</w:t>
-      </w:r>
-      <w:r>
-        <w:rPr>
-          <w:rFonts w:ascii="Consolas" w:hAnsi="Consolas"/>
-          <w:sz w:val="20"/>
-          <w:szCs w:val="20"/>
-        </w:rPr>
+        <w:t>upper_case = "A" | "B" | "C" | "D" | "E" | "F" | "G" | "H" | "I" | "J" | "K" | "L" | "M" | "N" | "O" | "P" | "Q" | "R" | "S" | "T" | "U" | "V" | "W" | "X" | "Y" | "Z";</w:t>
+      </w:r>
+    </w:p>
+    <w:p>
+      <w:pPr>
+        <w:ind w:left="1440" w:hanging="1440"/>
+      </w:pPr>
+      <w:r>
+        <w:t xml:space="preserve">  </w:t>
+      </w:r>
+      <w:r>
+        <w:t xml:space="preserve">lower_case = </w:t>
+      </w:r>
+      <w:r>
+        <w:rPr>
+          <w:rFonts w:ascii="Consolas" w:hAnsi="Consolas"/>
+          <w:sz w:val="20"/>
+          <w:szCs w:val="20"/>
+        </w:rPr>
+        <w:t>"</w:t>
+      </w:r>
+      <w:r>
+        <w:t>a</w:t>
+      </w:r>
+      <w:r>
+        <w:rPr>
+          <w:rFonts w:ascii="Consolas" w:hAnsi="Consolas"/>
+          <w:sz w:val="20"/>
+          <w:szCs w:val="20"/>
+        </w:rPr>
+        <w:t>"</w:t>
+      </w:r>
+      <w:r>
         <w:t xml:space="preserve"> | </w:t>
       </w:r>
       <w:r>
@@ -553,27 +616,17 @@
         <w:t>"</w:t>
       </w:r>
       <w:r>
-        <w:rPr>
-          <w:rFonts w:ascii="Consolas" w:hAnsi="Consolas"/>
-          <w:sz w:val="20"/>
-          <w:szCs w:val="20"/>
-        </w:rPr>
-        <w:t>E</w:t>
-      </w:r>
-      <w:r>
-        <w:rPr>
-          <w:rFonts w:ascii="Consolas" w:hAnsi="Consolas"/>
-          <w:sz w:val="20"/>
-          <w:szCs w:val="20"/>
-        </w:rPr>
-        <w:t>"</w:t>
-      </w:r>
-      <w:r>
-        <w:rPr>
-          <w:rFonts w:ascii="Consolas" w:hAnsi="Consolas"/>
-          <w:sz w:val="20"/>
-          <w:szCs w:val="20"/>
-        </w:rPr>
+        <w:t>b</w:t>
+      </w:r>
+      <w:r>
+        <w:rPr>
+          <w:rFonts w:ascii="Consolas" w:hAnsi="Consolas"/>
+          <w:sz w:val="20"/>
+          <w:szCs w:val="20"/>
+        </w:rPr>
+        <w:t>"</w:t>
+      </w:r>
+      <w:r>
         <w:t xml:space="preserve"> | </w:t>
       </w:r>
       <w:r>
@@ -585,27 +638,17 @@
         <w:t>"</w:t>
       </w:r>
       <w:r>
-        <w:rPr>
-          <w:rFonts w:ascii="Consolas" w:hAnsi="Consolas"/>
-          <w:sz w:val="20"/>
-          <w:szCs w:val="20"/>
-        </w:rPr>
-        <w:t>F</w:t>
-      </w:r>
-      <w:r>
-        <w:rPr>
-          <w:rFonts w:ascii="Consolas" w:hAnsi="Consolas"/>
-          <w:sz w:val="20"/>
-          <w:szCs w:val="20"/>
-        </w:rPr>
-        <w:t>"</w:t>
-      </w:r>
-      <w:r>
-        <w:rPr>
-          <w:rFonts w:ascii="Consolas" w:hAnsi="Consolas"/>
-          <w:sz w:val="20"/>
-          <w:szCs w:val="20"/>
-        </w:rPr>
+        <w:t>c</w:t>
+      </w:r>
+      <w:r>
+        <w:rPr>
+          <w:rFonts w:ascii="Consolas" w:hAnsi="Consolas"/>
+          <w:sz w:val="20"/>
+          <w:szCs w:val="20"/>
+        </w:rPr>
+        <w:t>"</w:t>
+      </w:r>
+      <w:r>
         <w:t xml:space="preserve"> | </w:t>
       </w:r>
       <w:r>
@@ -617,27 +660,17 @@
         <w:t>"</w:t>
       </w:r>
       <w:r>
-        <w:rPr>
-          <w:rFonts w:ascii="Consolas" w:hAnsi="Consolas"/>
-          <w:sz w:val="20"/>
-          <w:szCs w:val="20"/>
-        </w:rPr>
-        <w:t>G</w:t>
-      </w:r>
-      <w:r>
-        <w:rPr>
-          <w:rFonts w:ascii="Consolas" w:hAnsi="Consolas"/>
-          <w:sz w:val="20"/>
-          <w:szCs w:val="20"/>
-        </w:rPr>
-        <w:t>"</w:t>
-      </w:r>
-      <w:r>
-        <w:rPr>
-          <w:rFonts w:ascii="Consolas" w:hAnsi="Consolas"/>
-          <w:sz w:val="20"/>
-          <w:szCs w:val="20"/>
-        </w:rPr>
+        <w:t>d</w:t>
+      </w:r>
+      <w:r>
+        <w:rPr>
+          <w:rFonts w:ascii="Consolas" w:hAnsi="Consolas"/>
+          <w:sz w:val="20"/>
+          <w:szCs w:val="20"/>
+        </w:rPr>
+        <w:t>"</w:t>
+      </w:r>
+      <w:r>
         <w:t xml:space="preserve"> | </w:t>
       </w:r>
       <w:r>
@@ -649,27 +682,61 @@
         <w:t>"</w:t>
       </w:r>
       <w:r>
-        <w:rPr>
-          <w:rFonts w:ascii="Consolas" w:hAnsi="Consolas"/>
-          <w:sz w:val="20"/>
-          <w:szCs w:val="20"/>
-        </w:rPr>
-        <w:t>H</w:t>
-      </w:r>
-      <w:r>
-        <w:rPr>
-          <w:rFonts w:ascii="Consolas" w:hAnsi="Consolas"/>
-          <w:sz w:val="20"/>
-          <w:szCs w:val="20"/>
-        </w:rPr>
-        <w:t>"</w:t>
-      </w:r>
-      <w:r>
-        <w:rPr>
-          <w:rFonts w:ascii="Consolas" w:hAnsi="Consolas"/>
-          <w:sz w:val="20"/>
-          <w:szCs w:val="20"/>
-        </w:rPr>
+        <w:t>e</w:t>
+      </w:r>
+      <w:r>
+        <w:rPr>
+          <w:rFonts w:ascii="Consolas" w:hAnsi="Consolas"/>
+          <w:sz w:val="20"/>
+          <w:szCs w:val="20"/>
+        </w:rPr>
+        <w:t>"</w:t>
+      </w:r>
+      <w:r>
+        <w:t xml:space="preserve"> </w:t>
+      </w:r>
+      <w:r>
+        <w:t xml:space="preserve">| </w:t>
+      </w:r>
+      <w:r>
+        <w:rPr>
+          <w:rFonts w:ascii="Consolas" w:hAnsi="Consolas"/>
+          <w:sz w:val="20"/>
+          <w:szCs w:val="20"/>
+        </w:rPr>
+        <w:t>"f"</w:t>
+      </w:r>
+      <w:r>
+        <w:rPr>
+          <w:rFonts w:ascii="Consolas" w:hAnsi="Consolas"/>
+          <w:sz w:val="20"/>
+          <w:szCs w:val="20"/>
+        </w:rPr>
+        <w:t xml:space="preserve"> </w:t>
+      </w:r>
+      <w:r>
+        <w:t xml:space="preserve">| </w:t>
+      </w:r>
+      <w:r>
+        <w:rPr>
+          <w:rFonts w:ascii="Consolas" w:hAnsi="Consolas"/>
+          <w:sz w:val="20"/>
+          <w:szCs w:val="20"/>
+        </w:rPr>
+        <w:t>"</w:t>
+      </w:r>
+      <w:r>
+        <w:t>g</w:t>
+      </w:r>
+      <w:r>
+        <w:rPr>
+          <w:rFonts w:ascii="Consolas" w:hAnsi="Consolas"/>
+          <w:sz w:val="20"/>
+          <w:szCs w:val="20"/>
+        </w:rPr>
+        <w:t>"</w:t>
+      </w:r>
+      <w:r>
         <w:t xml:space="preserve"> | </w:t>
       </w:r>
       <w:r>
@@ -681,27 +748,41 @@
         <w:t>"</w:t>
       </w:r>
       <w:r>
-        <w:rPr>
-          <w:rFonts w:ascii="Consolas" w:hAnsi="Consolas"/>
-          <w:sz w:val="20"/>
-          <w:szCs w:val="20"/>
-        </w:rPr>
-        <w:t>I</w:t>
-      </w:r>
-      <w:r>
-        <w:rPr>
-          <w:rFonts w:ascii="Consolas" w:hAnsi="Consolas"/>
-          <w:sz w:val="20"/>
-          <w:szCs w:val="20"/>
-        </w:rPr>
-        <w:t>"</w:t>
-      </w:r>
-      <w:r>
-        <w:rPr>
-          <w:rFonts w:ascii="Consolas" w:hAnsi="Consolas"/>
-          <w:sz w:val="20"/>
-          <w:szCs w:val="20"/>
-        </w:rPr>
+        <w:t>h</w:t>
+      </w:r>
+      <w:r>
+        <w:rPr>
+          <w:rFonts w:ascii="Consolas" w:hAnsi="Consolas"/>
+          <w:sz w:val="20"/>
+          <w:szCs w:val="20"/>
+        </w:rPr>
+        <w:t>"</w:t>
+      </w:r>
+      <w:r>
+        <w:t xml:space="preserve"> |</w:t>
+      </w:r>
+      <w:r>
+        <w:rPr>
+          <w:rFonts w:ascii="Consolas" w:hAnsi="Consolas"/>
+          <w:sz w:val="20"/>
+          <w:szCs w:val="20"/>
+        </w:rPr>
+        <w:t xml:space="preserve"> "</w:t>
+      </w:r>
+      <w:proofErr w:type="spellStart"/>
+      <w:r>
+        <w:t>i</w:t>
+      </w:r>
+      <w:proofErr w:type="spellEnd"/>
+      <w:r>
+        <w:rPr>
+          <w:rFonts w:ascii="Consolas" w:hAnsi="Consolas"/>
+          <w:sz w:val="20"/>
+          <w:szCs w:val="20"/>
+        </w:rPr>
+        <w:t>"</w:t>
+      </w:r>
+      <w:r>
         <w:t xml:space="preserve"> | </w:t>
       </w:r>
       <w:r>
@@ -713,27 +794,17 @@
         <w:t>"</w:t>
       </w:r>
       <w:r>
-        <w:rPr>
-          <w:rFonts w:ascii="Consolas" w:hAnsi="Consolas"/>
-          <w:sz w:val="20"/>
-          <w:szCs w:val="20"/>
-        </w:rPr>
-        <w:t>J</w:t>
-      </w:r>
-      <w:r>
-        <w:rPr>
-          <w:rFonts w:ascii="Consolas" w:hAnsi="Consolas"/>
-          <w:sz w:val="20"/>
-          <w:szCs w:val="20"/>
-        </w:rPr>
-        <w:t>"</w:t>
-      </w:r>
-      <w:r>
-        <w:rPr>
-          <w:rFonts w:ascii="Consolas" w:hAnsi="Consolas"/>
-          <w:sz w:val="20"/>
-          <w:szCs w:val="20"/>
-        </w:rPr>
+        <w:t>j</w:t>
+      </w:r>
+      <w:r>
+        <w:rPr>
+          <w:rFonts w:ascii="Consolas" w:hAnsi="Consolas"/>
+          <w:sz w:val="20"/>
+          <w:szCs w:val="20"/>
+        </w:rPr>
+        <w:t>"</w:t>
+      </w:r>
+      <w:r>
         <w:t xml:space="preserve"> | </w:t>
       </w:r>
       <w:r>
@@ -745,27 +816,17 @@
         <w:t>"</w:t>
       </w:r>
       <w:r>
-        <w:rPr>
-          <w:rFonts w:ascii="Consolas" w:hAnsi="Consolas"/>
-          <w:sz w:val="20"/>
-          <w:szCs w:val="20"/>
-        </w:rPr>
-        <w:t>K</w:t>
-      </w:r>
-      <w:r>
-        <w:rPr>
-          <w:rFonts w:ascii="Consolas" w:hAnsi="Consolas"/>
-          <w:sz w:val="20"/>
-          <w:szCs w:val="20"/>
-        </w:rPr>
-        <w:t>"</w:t>
-      </w:r>
-      <w:r>
-        <w:rPr>
-          <w:rFonts w:ascii="Consolas" w:hAnsi="Consolas"/>
-          <w:sz w:val="20"/>
-          <w:szCs w:val="20"/>
-        </w:rPr>
+        <w:t>k</w:t>
+      </w:r>
+      <w:r>
+        <w:rPr>
+          <w:rFonts w:ascii="Consolas" w:hAnsi="Consolas"/>
+          <w:sz w:val="20"/>
+          <w:szCs w:val="20"/>
+        </w:rPr>
+        <w:t>"</w:t>
+      </w:r>
+      <w:r>
         <w:t xml:space="preserve"> | </w:t>
       </w:r>
       <w:r>
@@ -777,27 +838,17 @@
         <w:t>"</w:t>
       </w:r>
       <w:r>
-        <w:rPr>
-          <w:rFonts w:ascii="Consolas" w:hAnsi="Consolas"/>
-          <w:sz w:val="20"/>
-          <w:szCs w:val="20"/>
-        </w:rPr>
-        <w:t>L</w:t>
-      </w:r>
-      <w:r>
-        <w:rPr>
-          <w:rFonts w:ascii="Consolas" w:hAnsi="Consolas"/>
-          <w:sz w:val="20"/>
-          <w:szCs w:val="20"/>
-        </w:rPr>
-        <w:t>"</w:t>
-      </w:r>
-      <w:r>
-        <w:rPr>
-          <w:rFonts w:ascii="Consolas" w:hAnsi="Consolas"/>
-          <w:sz w:val="20"/>
-          <w:szCs w:val="20"/>
-        </w:rPr>
+        <w:t>l</w:t>
+      </w:r>
+      <w:r>
+        <w:rPr>
+          <w:rFonts w:ascii="Consolas" w:hAnsi="Consolas"/>
+          <w:sz w:val="20"/>
+          <w:szCs w:val="20"/>
+        </w:rPr>
+        <w:t>"</w:t>
+      </w:r>
+      <w:r>
         <w:t xml:space="preserve"> | </w:t>
       </w:r>
       <w:r>
@@ -809,27 +860,17 @@
         <w:t>"</w:t>
       </w:r>
       <w:r>
-        <w:rPr>
-          <w:rFonts w:ascii="Consolas" w:hAnsi="Consolas"/>
-          <w:sz w:val="20"/>
-          <w:szCs w:val="20"/>
-        </w:rPr>
-        <w:t>M</w:t>
-      </w:r>
-      <w:r>
-        <w:rPr>
-          <w:rFonts w:ascii="Consolas" w:hAnsi="Consolas"/>
-          <w:sz w:val="20"/>
-          <w:szCs w:val="20"/>
-        </w:rPr>
-        <w:t>"</w:t>
-      </w:r>
-      <w:r>
-        <w:rPr>
-          <w:rFonts w:ascii="Consolas" w:hAnsi="Consolas"/>
-          <w:sz w:val="20"/>
-          <w:szCs w:val="20"/>
-        </w:rPr>
+        <w:t>m</w:t>
+      </w:r>
+      <w:r>
+        <w:rPr>
+          <w:rFonts w:ascii="Consolas" w:hAnsi="Consolas"/>
+          <w:sz w:val="20"/>
+          <w:szCs w:val="20"/>
+        </w:rPr>
+        <w:t>"</w:t>
+      </w:r>
+      <w:r>
         <w:t xml:space="preserve"> | </w:t>
       </w:r>
       <w:r>
@@ -841,27 +882,17 @@
         <w:t>"</w:t>
       </w:r>
       <w:r>
-        <w:rPr>
-          <w:rFonts w:ascii="Consolas" w:hAnsi="Consolas"/>
-          <w:sz w:val="20"/>
-          <w:szCs w:val="20"/>
-        </w:rPr>
-        <w:t>N</w:t>
-      </w:r>
-      <w:r>
-        <w:rPr>
-          <w:rFonts w:ascii="Consolas" w:hAnsi="Consolas"/>
-          <w:sz w:val="20"/>
-          <w:szCs w:val="20"/>
-        </w:rPr>
-        <w:t>"</w:t>
-      </w:r>
-      <w:r>
-        <w:rPr>
-          <w:rFonts w:ascii="Consolas" w:hAnsi="Consolas"/>
-          <w:sz w:val="20"/>
-          <w:szCs w:val="20"/>
-        </w:rPr>
+        <w:t>n</w:t>
+      </w:r>
+      <w:r>
+        <w:rPr>
+          <w:rFonts w:ascii="Consolas" w:hAnsi="Consolas"/>
+          <w:sz w:val="20"/>
+          <w:szCs w:val="20"/>
+        </w:rPr>
+        <w:t>"</w:t>
+      </w:r>
+      <w:r>
         <w:t xml:space="preserve"> | </w:t>
       </w:r>
       <w:r>
@@ -873,27 +904,42 @@
         <w:t>"</w:t>
       </w:r>
       <w:r>
-        <w:rPr>
-          <w:rFonts w:ascii="Consolas" w:hAnsi="Consolas"/>
-          <w:sz w:val="20"/>
-          <w:szCs w:val="20"/>
-        </w:rPr>
-        <w:t>O</w:t>
-      </w:r>
-      <w:r>
-        <w:rPr>
-          <w:rFonts w:ascii="Consolas" w:hAnsi="Consolas"/>
-          <w:sz w:val="20"/>
-          <w:szCs w:val="20"/>
-        </w:rPr>
-        <w:t>"</w:t>
-      </w:r>
-      <w:r>
-        <w:rPr>
-          <w:rFonts w:ascii="Consolas" w:hAnsi="Consolas"/>
-          <w:sz w:val="20"/>
-          <w:szCs w:val="20"/>
-        </w:rPr>
+        <w:t>o</w:t>
+      </w:r>
+      <w:r>
+        <w:rPr>
+          <w:rFonts w:ascii="Consolas" w:hAnsi="Consolas"/>
+          <w:sz w:val="20"/>
+          <w:szCs w:val="20"/>
+        </w:rPr>
+        <w:t>"</w:t>
+      </w:r>
+      <w:r>
+        <w:t xml:space="preserve"> |</w:t>
+      </w:r>
+      <w:r>
+        <w:t xml:space="preserve"> </w:t>
+      </w:r>
+      <w:r>
+        <w:rPr>
+          <w:rFonts w:ascii="Consolas" w:hAnsi="Consolas"/>
+          <w:sz w:val="20"/>
+          <w:szCs w:val="20"/>
+        </w:rPr>
+        <w:t>"</w:t>
+      </w:r>
+      <w:r>
+        <w:t>p</w:t>
+      </w:r>
+      <w:r>
+        <w:rPr>
+          <w:rFonts w:ascii="Consolas" w:hAnsi="Consolas"/>
+          <w:sz w:val="20"/>
+          <w:szCs w:val="20"/>
+        </w:rPr>
+        <w:t>"</w:t>
+      </w:r>
+      <w:r>
         <w:t xml:space="preserve"> | </w:t>
       </w:r>
       <w:r>
@@ -905,27 +951,17 @@
         <w:t>"</w:t>
       </w:r>
       <w:r>
-        <w:rPr>
-          <w:rFonts w:ascii="Consolas" w:hAnsi="Consolas"/>
-          <w:sz w:val="20"/>
-          <w:szCs w:val="20"/>
-        </w:rPr>
-        <w:t>P</w:t>
-      </w:r>
-      <w:r>
-        <w:rPr>
-          <w:rFonts w:ascii="Consolas" w:hAnsi="Consolas"/>
-          <w:sz w:val="20"/>
-          <w:szCs w:val="20"/>
-        </w:rPr>
-        <w:t>"</w:t>
-      </w:r>
-      <w:r>
-        <w:rPr>
-          <w:rFonts w:ascii="Consolas" w:hAnsi="Consolas"/>
-          <w:sz w:val="20"/>
-          <w:szCs w:val="20"/>
-        </w:rPr>
+        <w:t>q</w:t>
+      </w:r>
+      <w:r>
+        <w:rPr>
+          <w:rFonts w:ascii="Consolas" w:hAnsi="Consolas"/>
+          <w:sz w:val="20"/>
+          <w:szCs w:val="20"/>
+        </w:rPr>
+        <w:t>"</w:t>
+      </w:r>
+      <w:r>
         <w:t xml:space="preserve"> | </w:t>
       </w:r>
       <w:r>
@@ -937,27 +973,17 @@
         <w:t>"</w:t>
       </w:r>
       <w:r>
-        <w:rPr>
-          <w:rFonts w:ascii="Consolas" w:hAnsi="Consolas"/>
-          <w:sz w:val="20"/>
-          <w:szCs w:val="20"/>
-        </w:rPr>
-        <w:t>Q</w:t>
-      </w:r>
-      <w:r>
-        <w:rPr>
-          <w:rFonts w:ascii="Consolas" w:hAnsi="Consolas"/>
-          <w:sz w:val="20"/>
-          <w:szCs w:val="20"/>
-        </w:rPr>
-        <w:t>"</w:t>
-      </w:r>
-      <w:r>
-        <w:rPr>
-          <w:rFonts w:ascii="Consolas" w:hAnsi="Consolas"/>
-          <w:sz w:val="20"/>
-          <w:szCs w:val="20"/>
-        </w:rPr>
+        <w:t>r</w:t>
+      </w:r>
+      <w:r>
+        <w:rPr>
+          <w:rFonts w:ascii="Consolas" w:hAnsi="Consolas"/>
+          <w:sz w:val="20"/>
+          <w:szCs w:val="20"/>
+        </w:rPr>
+        <w:t>"</w:t>
+      </w:r>
+      <w:r>
         <w:t xml:space="preserve"> | </w:t>
       </w:r>
       <w:r>
@@ -969,27 +995,17 @@
         <w:t>"</w:t>
       </w:r>
       <w:r>
-        <w:rPr>
-          <w:rFonts w:ascii="Consolas" w:hAnsi="Consolas"/>
-          <w:sz w:val="20"/>
-          <w:szCs w:val="20"/>
-        </w:rPr>
-        <w:t>R</w:t>
-      </w:r>
-      <w:r>
-        <w:rPr>
-          <w:rFonts w:ascii="Consolas" w:hAnsi="Consolas"/>
-          <w:sz w:val="20"/>
-          <w:szCs w:val="20"/>
-        </w:rPr>
-        <w:t>"</w:t>
-      </w:r>
-      <w:r>
-        <w:rPr>
-          <w:rFonts w:ascii="Consolas" w:hAnsi="Consolas"/>
-          <w:sz w:val="20"/>
-          <w:szCs w:val="20"/>
-        </w:rPr>
+        <w:t>s</w:t>
+      </w:r>
+      <w:r>
+        <w:rPr>
+          <w:rFonts w:ascii="Consolas" w:hAnsi="Consolas"/>
+          <w:sz w:val="20"/>
+          <w:szCs w:val="20"/>
+        </w:rPr>
+        <w:t>"</w:t>
+      </w:r>
+      <w:r>
         <w:t xml:space="preserve"> | </w:t>
       </w:r>
       <w:r>
@@ -1001,27 +1017,17 @@
         <w:t>"</w:t>
       </w:r>
       <w:r>
-        <w:rPr>
-          <w:rFonts w:ascii="Consolas" w:hAnsi="Consolas"/>
-          <w:sz w:val="20"/>
-          <w:szCs w:val="20"/>
-        </w:rPr>
-        <w:t>S</w:t>
-      </w:r>
-      <w:r>
-        <w:rPr>
-          <w:rFonts w:ascii="Consolas" w:hAnsi="Consolas"/>
-          <w:sz w:val="20"/>
-          <w:szCs w:val="20"/>
-        </w:rPr>
-        <w:t>"</w:t>
-      </w:r>
-      <w:r>
-        <w:rPr>
-          <w:rFonts w:ascii="Consolas" w:hAnsi="Consolas"/>
-          <w:sz w:val="20"/>
-          <w:szCs w:val="20"/>
-        </w:rPr>
+        <w:t>t</w:t>
+      </w:r>
+      <w:r>
+        <w:rPr>
+          <w:rFonts w:ascii="Consolas" w:hAnsi="Consolas"/>
+          <w:sz w:val="20"/>
+          <w:szCs w:val="20"/>
+        </w:rPr>
+        <w:t>"</w:t>
+      </w:r>
+      <w:r>
         <w:t xml:space="preserve"> | </w:t>
       </w:r>
       <w:r>
@@ -1033,27 +1039,17 @@
         <w:t>"</w:t>
       </w:r>
       <w:r>
-        <w:rPr>
-          <w:rFonts w:ascii="Consolas" w:hAnsi="Consolas"/>
-          <w:sz w:val="20"/>
-          <w:szCs w:val="20"/>
-        </w:rPr>
-        <w:t>T</w:t>
-      </w:r>
-      <w:r>
-        <w:rPr>
-          <w:rFonts w:ascii="Consolas" w:hAnsi="Consolas"/>
-          <w:sz w:val="20"/>
-          <w:szCs w:val="20"/>
-        </w:rPr>
-        <w:t>"</w:t>
-      </w:r>
-      <w:r>
-        <w:rPr>
-          <w:rFonts w:ascii="Consolas" w:hAnsi="Consolas"/>
-          <w:sz w:val="20"/>
-          <w:szCs w:val="20"/>
-        </w:rPr>
+        <w:t>u</w:t>
+      </w:r>
+      <w:r>
+        <w:rPr>
+          <w:rFonts w:ascii="Consolas" w:hAnsi="Consolas"/>
+          <w:sz w:val="20"/>
+          <w:szCs w:val="20"/>
+        </w:rPr>
+        <w:t>"</w:t>
+      </w:r>
+      <w:r>
         <w:t xml:space="preserve"> | </w:t>
       </w:r>
       <w:r>
@@ -1065,27 +1061,17 @@
         <w:t>"</w:t>
       </w:r>
       <w:r>
-        <w:rPr>
-          <w:rFonts w:ascii="Consolas" w:hAnsi="Consolas"/>
-          <w:sz w:val="20"/>
-          <w:szCs w:val="20"/>
-        </w:rPr>
-        <w:t>U</w:t>
-      </w:r>
-      <w:r>
-        <w:rPr>
-          <w:rFonts w:ascii="Consolas" w:hAnsi="Consolas"/>
-          <w:sz w:val="20"/>
-          <w:szCs w:val="20"/>
-        </w:rPr>
-        <w:t>"</w:t>
-      </w:r>
-      <w:r>
-        <w:rPr>
-          <w:rFonts w:ascii="Consolas" w:hAnsi="Consolas"/>
-          <w:sz w:val="20"/>
-          <w:szCs w:val="20"/>
-        </w:rPr>
+        <w:t>v</w:t>
+      </w:r>
+      <w:r>
+        <w:rPr>
+          <w:rFonts w:ascii="Consolas" w:hAnsi="Consolas"/>
+          <w:sz w:val="20"/>
+          <w:szCs w:val="20"/>
+        </w:rPr>
+        <w:t>"</w:t>
+      </w:r>
+      <w:r>
         <w:t xml:space="preserve"> | </w:t>
       </w:r>
       <w:r>
@@ -1097,27 +1083,17 @@
         <w:t>"</w:t>
       </w:r>
       <w:r>
-        <w:rPr>
-          <w:rFonts w:ascii="Consolas" w:hAnsi="Consolas"/>
-          <w:sz w:val="20"/>
-          <w:szCs w:val="20"/>
-        </w:rPr>
-        <w:t>V</w:t>
-      </w:r>
-      <w:r>
-        <w:rPr>
-          <w:rFonts w:ascii="Consolas" w:hAnsi="Consolas"/>
-          <w:sz w:val="20"/>
-          <w:szCs w:val="20"/>
-        </w:rPr>
-        <w:t>"</w:t>
-      </w:r>
-      <w:r>
-        <w:rPr>
-          <w:rFonts w:ascii="Consolas" w:hAnsi="Consolas"/>
-          <w:sz w:val="20"/>
-          <w:szCs w:val="20"/>
-        </w:rPr>
+        <w:t>w</w:t>
+      </w:r>
+      <w:r>
+        <w:rPr>
+          <w:rFonts w:ascii="Consolas" w:hAnsi="Consolas"/>
+          <w:sz w:val="20"/>
+          <w:szCs w:val="20"/>
+        </w:rPr>
+        <w:t>"</w:t>
+      </w:r>
+      <w:r>
         <w:t xml:space="preserve"> | </w:t>
       </w:r>
       <w:r>
@@ -1129,27 +1105,17 @@
         <w:t>"</w:t>
       </w:r>
       <w:r>
-        <w:rPr>
-          <w:rFonts w:ascii="Consolas" w:hAnsi="Consolas"/>
-          <w:sz w:val="20"/>
-          <w:szCs w:val="20"/>
-        </w:rPr>
-        <w:t>W</w:t>
-      </w:r>
-      <w:r>
-        <w:rPr>
-          <w:rFonts w:ascii="Consolas" w:hAnsi="Consolas"/>
-          <w:sz w:val="20"/>
-          <w:szCs w:val="20"/>
-        </w:rPr>
-        <w:t>"</w:t>
-      </w:r>
-      <w:r>
-        <w:rPr>
-          <w:rFonts w:ascii="Consolas" w:hAnsi="Consolas"/>
-          <w:sz w:val="20"/>
-          <w:szCs w:val="20"/>
-        </w:rPr>
+        <w:t>x</w:t>
+      </w:r>
+      <w:r>
+        <w:rPr>
+          <w:rFonts w:ascii="Consolas" w:hAnsi="Consolas"/>
+          <w:sz w:val="20"/>
+          <w:szCs w:val="20"/>
+        </w:rPr>
+        <w:t>"</w:t>
+      </w:r>
+      <w:r>
         <w:t xml:space="preserve"> | </w:t>
       </w:r>
       <w:r>
@@ -1161,27 +1127,17 @@
         <w:t>"</w:t>
       </w:r>
       <w:r>
-        <w:rPr>
-          <w:rFonts w:ascii="Consolas" w:hAnsi="Consolas"/>
-          <w:sz w:val="20"/>
-          <w:szCs w:val="20"/>
-        </w:rPr>
-        <w:t>X</w:t>
-      </w:r>
-      <w:r>
-        <w:rPr>
-          <w:rFonts w:ascii="Consolas" w:hAnsi="Consolas"/>
-          <w:sz w:val="20"/>
-          <w:szCs w:val="20"/>
-        </w:rPr>
-        <w:t>"</w:t>
-      </w:r>
-      <w:r>
-        <w:rPr>
-          <w:rFonts w:ascii="Consolas" w:hAnsi="Consolas"/>
-          <w:sz w:val="20"/>
-          <w:szCs w:val="20"/>
-        </w:rPr>
+        <w:t>y</w:t>
+      </w:r>
+      <w:r>
+        <w:rPr>
+          <w:rFonts w:ascii="Consolas" w:hAnsi="Consolas"/>
+          <w:sz w:val="20"/>
+          <w:szCs w:val="20"/>
+        </w:rPr>
+        <w:t>"</w:t>
+      </w:r>
+      <w:r>
         <w:t xml:space="preserve"> | </w:t>
       </w:r>
       <w:r>
@@ -1193,739 +1149,85 @@
         <w:t>"</w:t>
       </w:r>
       <w:r>
-        <w:rPr>
-          <w:rFonts w:ascii="Consolas" w:hAnsi="Consolas"/>
-          <w:sz w:val="20"/>
-          <w:szCs w:val="20"/>
-        </w:rPr>
-        <w:t>Y</w:t>
-      </w:r>
-      <w:r>
-        <w:rPr>
-          <w:rFonts w:ascii="Consolas" w:hAnsi="Consolas"/>
-          <w:sz w:val="20"/>
-          <w:szCs w:val="20"/>
-        </w:rPr>
-        <w:t>"</w:t>
-      </w:r>
-      <w:r>
-        <w:rPr>
-          <w:rFonts w:ascii="Consolas" w:hAnsi="Consolas"/>
-          <w:sz w:val="20"/>
-          <w:szCs w:val="20"/>
-        </w:rPr>
-        <w:t xml:space="preserve"> | </w:t>
-      </w:r>
-      <w:r>
-        <w:rPr>
-          <w:rFonts w:ascii="Consolas" w:hAnsi="Consolas"/>
-          <w:sz w:val="20"/>
-          <w:szCs w:val="20"/>
-        </w:rPr>
-        <w:t>"</w:t>
-      </w:r>
-      <w:r>
-        <w:rPr>
-          <w:rFonts w:ascii="Consolas" w:hAnsi="Consolas"/>
-          <w:sz w:val="20"/>
-          <w:szCs w:val="20"/>
-        </w:rPr>
-        <w:t>Z</w:t>
-      </w:r>
-      <w:r>
-        <w:rPr>
-          <w:rFonts w:ascii="Consolas" w:hAnsi="Consolas"/>
-          <w:sz w:val="20"/>
-          <w:szCs w:val="20"/>
-        </w:rPr>
-        <w:t>"</w:t>
-      </w:r>
-      <w:r>
-        <w:rPr>
-          <w:rFonts w:ascii="Consolas" w:hAnsi="Consolas"/>
-          <w:sz w:val="20"/>
-          <w:szCs w:val="20"/>
-        </w:rPr>
+        <w:t>z</w:t>
+      </w:r>
+      <w:r>
+        <w:rPr>
+          <w:rFonts w:ascii="Consolas" w:hAnsi="Consolas"/>
+          <w:sz w:val="20"/>
+          <w:szCs w:val="20"/>
+        </w:rPr>
+        <w:t>"</w:t>
+      </w:r>
+      <w:r>
         <w:t>;</w:t>
       </w:r>
     </w:p>
     <w:p>
       <w:pPr>
-        <w:ind w:left="1440" w:hanging="1440"/>
+        <w:ind w:left="864" w:hanging="864"/>
       </w:pPr>
       <w:r>
         <w:t xml:space="preserve">  </w:t>
       </w:r>
       <w:r>
-        <w:t xml:space="preserve">lower_case = </w:t>
-      </w:r>
-      <w:r>
-        <w:rPr>
-          <w:rFonts w:ascii="Consolas" w:hAnsi="Consolas"/>
-          <w:sz w:val="20"/>
-          <w:szCs w:val="20"/>
-        </w:rPr>
-        <w:t>"</w:t>
-      </w:r>
-      <w:r>
-        <w:t>a</w:t>
-      </w:r>
-      <w:r>
-        <w:rPr>
-          <w:rFonts w:ascii="Consolas" w:hAnsi="Consolas"/>
-          <w:sz w:val="20"/>
-          <w:szCs w:val="20"/>
-        </w:rPr>
-        <w:t>"</w:t>
-      </w:r>
-      <w:r>
-        <w:t xml:space="preserve"> | </w:t>
-      </w:r>
-      <w:r>
-        <w:rPr>
-          <w:rFonts w:ascii="Consolas" w:hAnsi="Consolas"/>
-          <w:sz w:val="20"/>
-          <w:szCs w:val="20"/>
-        </w:rPr>
-        <w:t>"</w:t>
-      </w:r>
-      <w:r>
-        <w:t>b</w:t>
-      </w:r>
-      <w:r>
-        <w:rPr>
-          <w:rFonts w:ascii="Consolas" w:hAnsi="Consolas"/>
-          <w:sz w:val="20"/>
-          <w:szCs w:val="20"/>
-        </w:rPr>
-        <w:t>"</w:t>
-      </w:r>
-      <w:r>
-        <w:t xml:space="preserve"> | </w:t>
-      </w:r>
-      <w:r>
-        <w:rPr>
-          <w:rFonts w:ascii="Consolas" w:hAnsi="Consolas"/>
-          <w:sz w:val="20"/>
-          <w:szCs w:val="20"/>
-        </w:rPr>
-        <w:t>"</w:t>
-      </w:r>
-      <w:r>
-        <w:t>c</w:t>
-      </w:r>
-      <w:r>
-        <w:rPr>
-          <w:rFonts w:ascii="Consolas" w:hAnsi="Consolas"/>
-          <w:sz w:val="20"/>
-          <w:szCs w:val="20"/>
-        </w:rPr>
-        <w:t>"</w:t>
-      </w:r>
-      <w:r>
-        <w:t xml:space="preserve"> | </w:t>
-      </w:r>
-      <w:r>
-        <w:rPr>
-          <w:rFonts w:ascii="Consolas" w:hAnsi="Consolas"/>
-          <w:sz w:val="20"/>
-          <w:szCs w:val="20"/>
-        </w:rPr>
-        <w:t>"</w:t>
-      </w:r>
-      <w:r>
-        <w:t>d</w:t>
-      </w:r>
-      <w:r>
-        <w:rPr>
-          <w:rFonts w:ascii="Consolas" w:hAnsi="Consolas"/>
-          <w:sz w:val="20"/>
-          <w:szCs w:val="20"/>
-        </w:rPr>
-        <w:t>"</w:t>
-      </w:r>
-      <w:r>
-        <w:t xml:space="preserve"> | </w:t>
-      </w:r>
-      <w:r>
-        <w:rPr>
-          <w:rFonts w:ascii="Consolas" w:hAnsi="Consolas"/>
-          <w:sz w:val="20"/>
-          <w:szCs w:val="20"/>
-        </w:rPr>
-        <w:t>"</w:t>
-      </w:r>
-      <w:r>
-        <w:t>e</w:t>
-      </w:r>
-      <w:r>
-        <w:rPr>
-          <w:rFonts w:ascii="Consolas" w:hAnsi="Consolas"/>
-          <w:sz w:val="20"/>
-          <w:szCs w:val="20"/>
-        </w:rPr>
-        <w:t>"</w:t>
+        <w:t>folder = folder_char, [folder_char],</w:t>
+      </w:r>
+      <w:r>
+        <w:t xml:space="preserve"> [folder_char], [folder_char], [folder_char], [folder_char], [folder_char], [folder_char];</w:t>
+      </w:r>
+    </w:p>
+    <w:p>
+      <w:pPr>
+        <w:ind w:left="864" w:hanging="864"/>
+      </w:pPr>
+      <w:r>
+        <w:t xml:space="preserve">  </w:t>
+      </w:r>
+      <w:r>
+        <w:t>folder_char = letter | digit;</w:t>
+      </w:r>
+    </w:p>
+    <w:p>
+      <w:pPr>
+        <w:ind w:left="864" w:hanging="864"/>
+      </w:pPr>
+      <w:r>
+        <w:t xml:space="preserve">  </w:t>
+      </w:r>
+      <w:r>
+        <w:t>digit = "0" | "1" | "2" | "3" | "4" | "5" | "6" | "7" | "8" | "9";</w:t>
+      </w:r>
+    </w:p>
+    <w:p>
+      <w:pPr>
+        <w:ind w:left="864" w:hanging="864"/>
+      </w:pPr>
+      <w:r>
+        <w:t xml:space="preserve">  </w:t>
+      </w:r>
+      <w:r>
+        <w:t>path = folder,</w:t>
       </w:r>
       <w:r>
         <w:t xml:space="preserve"> </w:t>
       </w:r>
       <w:r>
-        <w:t xml:space="preserve">| </w:t>
-      </w:r>
-      <w:r>
-        <w:rPr>
-          <w:rFonts w:ascii="Consolas" w:hAnsi="Consolas"/>
-          <w:sz w:val="20"/>
-          <w:szCs w:val="20"/>
-        </w:rPr>
-        <w:t>"</w:t>
-      </w:r>
-      <w:r>
-        <w:rPr>
-          <w:rFonts w:ascii="Consolas" w:hAnsi="Consolas"/>
-          <w:sz w:val="20"/>
-          <w:szCs w:val="20"/>
-        </w:rPr>
-        <w:t>f</w:t>
-      </w:r>
-      <w:r>
-        <w:rPr>
-          <w:rFonts w:ascii="Consolas" w:hAnsi="Consolas"/>
-          <w:sz w:val="20"/>
-          <w:szCs w:val="20"/>
-        </w:rPr>
-        <w:t>"</w:t>
-      </w:r>
-      <w:r>
-        <w:rPr>
-          <w:rFonts w:ascii="Consolas" w:hAnsi="Consolas"/>
-          <w:sz w:val="20"/>
-          <w:szCs w:val="20"/>
-        </w:rPr>
-        <w:t xml:space="preserve"> </w:t>
-      </w:r>
-      <w:r>
-        <w:t xml:space="preserve">| </w:t>
-      </w:r>
-      <w:r>
-        <w:rPr>
-          <w:rFonts w:ascii="Consolas" w:hAnsi="Consolas"/>
-          <w:sz w:val="20"/>
-          <w:szCs w:val="20"/>
-        </w:rPr>
-        <w:t>"</w:t>
-      </w:r>
-      <w:r>
-        <w:t>g</w:t>
-      </w:r>
-      <w:r>
-        <w:rPr>
-          <w:rFonts w:ascii="Consolas" w:hAnsi="Consolas"/>
-          <w:sz w:val="20"/>
-          <w:szCs w:val="20"/>
-        </w:rPr>
-        <w:t>"</w:t>
-      </w:r>
-      <w:r>
-        <w:t xml:space="preserve"> | </w:t>
-      </w:r>
-      <w:r>
-        <w:rPr>
-          <w:rFonts w:ascii="Consolas" w:hAnsi="Consolas"/>
-          <w:sz w:val="20"/>
-          <w:szCs w:val="20"/>
-        </w:rPr>
-        <w:t>"</w:t>
-      </w:r>
-      <w:r>
-        <w:t>h</w:t>
-      </w:r>
-      <w:r>
-        <w:rPr>
-          <w:rFonts w:ascii="Consolas" w:hAnsi="Consolas"/>
-          <w:sz w:val="20"/>
-          <w:szCs w:val="20"/>
-        </w:rPr>
-        <w:t>"</w:t>
-      </w:r>
-      <w:r>
-        <w:t xml:space="preserve"> |</w:t>
-      </w:r>
-      <w:r>
-        <w:rPr>
-          <w:rFonts w:ascii="Consolas" w:hAnsi="Consolas"/>
-          <w:sz w:val="20"/>
-          <w:szCs w:val="20"/>
-        </w:rPr>
-        <w:t xml:space="preserve"> </w:t>
-      </w:r>
-      <w:r>
-        <w:rPr>
-          <w:rFonts w:ascii="Consolas" w:hAnsi="Consolas"/>
-          <w:sz w:val="20"/>
-          <w:szCs w:val="20"/>
-        </w:rPr>
-        <w:t>"</w:t>
-      </w:r>
-      <w:proofErr w:type="spellStart"/>
-      <w:r>
-        <w:t>i</w:t>
-      </w:r>
-      <w:proofErr w:type="spellEnd"/>
-      <w:r>
-        <w:rPr>
-          <w:rFonts w:ascii="Consolas" w:hAnsi="Consolas"/>
-          <w:sz w:val="20"/>
-          <w:szCs w:val="20"/>
-        </w:rPr>
-        <w:t>"</w:t>
-      </w:r>
-      <w:r>
-        <w:t xml:space="preserve"> | </w:t>
-      </w:r>
-      <w:r>
-        <w:rPr>
-          <w:rFonts w:ascii="Consolas" w:hAnsi="Consolas"/>
-          <w:sz w:val="20"/>
-          <w:szCs w:val="20"/>
-        </w:rPr>
-        <w:t>"</w:t>
-      </w:r>
-      <w:r>
-        <w:t>j</w:t>
-      </w:r>
-      <w:r>
-        <w:rPr>
-          <w:rFonts w:ascii="Consolas" w:hAnsi="Consolas"/>
-          <w:sz w:val="20"/>
-          <w:szCs w:val="20"/>
-        </w:rPr>
-        <w:t>"</w:t>
-      </w:r>
-      <w:r>
-        <w:t xml:space="preserve"> | </w:t>
-      </w:r>
-      <w:r>
-        <w:rPr>
-          <w:rFonts w:ascii="Consolas" w:hAnsi="Consolas"/>
-          <w:sz w:val="20"/>
-          <w:szCs w:val="20"/>
-        </w:rPr>
-        <w:t>"</w:t>
-      </w:r>
-      <w:r>
-        <w:t>k</w:t>
-      </w:r>
-      <w:r>
-        <w:rPr>
-          <w:rFonts w:ascii="Consolas" w:hAnsi="Consolas"/>
-          <w:sz w:val="20"/>
-          <w:szCs w:val="20"/>
-        </w:rPr>
-        <w:t>"</w:t>
-      </w:r>
-      <w:r>
-        <w:t xml:space="preserve"> | </w:t>
-      </w:r>
-      <w:r>
-        <w:rPr>
-          <w:rFonts w:ascii="Consolas" w:hAnsi="Consolas"/>
-          <w:sz w:val="20"/>
-          <w:szCs w:val="20"/>
-        </w:rPr>
-        <w:t>"</w:t>
-      </w:r>
-      <w:r>
-        <w:t>l</w:t>
-      </w:r>
-      <w:r>
-        <w:rPr>
-          <w:rFonts w:ascii="Consolas" w:hAnsi="Consolas"/>
-          <w:sz w:val="20"/>
-          <w:szCs w:val="20"/>
-        </w:rPr>
-        <w:t>"</w:t>
-      </w:r>
-      <w:r>
-        <w:t xml:space="preserve"> | </w:t>
-      </w:r>
-      <w:r>
-        <w:rPr>
-          <w:rFonts w:ascii="Consolas" w:hAnsi="Consolas"/>
-          <w:sz w:val="20"/>
-          <w:szCs w:val="20"/>
-        </w:rPr>
-        <w:t>"</w:t>
-      </w:r>
-      <w:r>
-        <w:t>m</w:t>
-      </w:r>
-      <w:r>
-        <w:rPr>
-          <w:rFonts w:ascii="Consolas" w:hAnsi="Consolas"/>
-          <w:sz w:val="20"/>
-          <w:szCs w:val="20"/>
-        </w:rPr>
-        <w:t>"</w:t>
-      </w:r>
-      <w:r>
-        <w:t xml:space="preserve"> | </w:t>
-      </w:r>
-      <w:r>
-        <w:rPr>
-          <w:rFonts w:ascii="Consolas" w:hAnsi="Consolas"/>
-          <w:sz w:val="20"/>
-          <w:szCs w:val="20"/>
-        </w:rPr>
-        <w:t>"</w:t>
-      </w:r>
-      <w:r>
-        <w:t>n</w:t>
-      </w:r>
-      <w:r>
-        <w:rPr>
-          <w:rFonts w:ascii="Consolas" w:hAnsi="Consolas"/>
-          <w:sz w:val="20"/>
-          <w:szCs w:val="20"/>
-        </w:rPr>
-        <w:t>"</w:t>
-      </w:r>
-      <w:r>
-        <w:t xml:space="preserve"> | </w:t>
-      </w:r>
-      <w:r>
-        <w:rPr>
-          <w:rFonts w:ascii="Consolas" w:hAnsi="Consolas"/>
-          <w:sz w:val="20"/>
-          <w:szCs w:val="20"/>
-        </w:rPr>
-        <w:t>"</w:t>
-      </w:r>
-      <w:r>
-        <w:t>o</w:t>
-      </w:r>
-      <w:r>
-        <w:rPr>
-          <w:rFonts w:ascii="Consolas" w:hAnsi="Consolas"/>
-          <w:sz w:val="20"/>
-          <w:szCs w:val="20"/>
-        </w:rPr>
-        <w:t>"</w:t>
-      </w:r>
-      <w:r>
-        <w:t xml:space="preserve"> |</w:t>
-      </w:r>
-      <w:r>
-        <w:t xml:space="preserve"> </w:t>
-      </w:r>
-      <w:r>
-        <w:rPr>
-          <w:rFonts w:ascii="Consolas" w:hAnsi="Consolas"/>
-          <w:sz w:val="20"/>
-          <w:szCs w:val="20"/>
-        </w:rPr>
-        <w:t>"</w:t>
-      </w:r>
-      <w:r>
-        <w:t>p</w:t>
-      </w:r>
-      <w:r>
-        <w:rPr>
-          <w:rFonts w:ascii="Consolas" w:hAnsi="Consolas"/>
-          <w:sz w:val="20"/>
-          <w:szCs w:val="20"/>
-        </w:rPr>
-        <w:t>"</w:t>
-      </w:r>
-      <w:r>
-        <w:t xml:space="preserve"> | </w:t>
-      </w:r>
-      <w:r>
-        <w:rPr>
-          <w:rFonts w:ascii="Consolas" w:hAnsi="Consolas"/>
-          <w:sz w:val="20"/>
-          <w:szCs w:val="20"/>
-        </w:rPr>
-        <w:t>"</w:t>
-      </w:r>
-      <w:r>
-        <w:t>q</w:t>
-      </w:r>
-      <w:r>
-        <w:rPr>
-          <w:rFonts w:ascii="Consolas" w:hAnsi="Consolas"/>
-          <w:sz w:val="20"/>
-          <w:szCs w:val="20"/>
-        </w:rPr>
-        <w:t>"</w:t>
-      </w:r>
-      <w:r>
-        <w:t xml:space="preserve"> | </w:t>
-      </w:r>
-      <w:r>
-        <w:rPr>
-          <w:rFonts w:ascii="Consolas" w:hAnsi="Consolas"/>
-          <w:sz w:val="20"/>
-          <w:szCs w:val="20"/>
-        </w:rPr>
-        <w:t>"</w:t>
-      </w:r>
-      <w:r>
-        <w:t>r</w:t>
-      </w:r>
-      <w:r>
-        <w:rPr>
-          <w:rFonts w:ascii="Consolas" w:hAnsi="Consolas"/>
-          <w:sz w:val="20"/>
-          <w:szCs w:val="20"/>
-        </w:rPr>
-        <w:t>"</w:t>
-      </w:r>
-      <w:r>
-        <w:t xml:space="preserve"> | </w:t>
-      </w:r>
-      <w:r>
-        <w:rPr>
-          <w:rFonts w:ascii="Consolas" w:hAnsi="Consolas"/>
-          <w:sz w:val="20"/>
-          <w:szCs w:val="20"/>
-        </w:rPr>
-        <w:t>"</w:t>
-      </w:r>
-      <w:r>
-        <w:t>s</w:t>
-      </w:r>
-      <w:r>
-        <w:rPr>
-          <w:rFonts w:ascii="Consolas" w:hAnsi="Consolas"/>
-          <w:sz w:val="20"/>
-          <w:szCs w:val="20"/>
-        </w:rPr>
-        <w:t>"</w:t>
-      </w:r>
-      <w:r>
-        <w:t xml:space="preserve"> | </w:t>
-      </w:r>
-      <w:r>
-        <w:rPr>
-          <w:rFonts w:ascii="Consolas" w:hAnsi="Consolas"/>
-          <w:sz w:val="20"/>
-          <w:szCs w:val="20"/>
-        </w:rPr>
-        <w:t>"</w:t>
-      </w:r>
-      <w:r>
-        <w:t>t</w:t>
-      </w:r>
-      <w:r>
-        <w:rPr>
-          <w:rFonts w:ascii="Consolas" w:hAnsi="Consolas"/>
-          <w:sz w:val="20"/>
-          <w:szCs w:val="20"/>
-        </w:rPr>
-        <w:t>"</w:t>
-      </w:r>
-      <w:r>
-        <w:t xml:space="preserve"> | </w:t>
-      </w:r>
-      <w:r>
-        <w:rPr>
-          <w:rFonts w:ascii="Consolas" w:hAnsi="Consolas"/>
-          <w:sz w:val="20"/>
-          <w:szCs w:val="20"/>
-        </w:rPr>
-        <w:t>"</w:t>
-      </w:r>
-      <w:r>
-        <w:t>u</w:t>
-      </w:r>
-      <w:r>
-        <w:rPr>
-          <w:rFonts w:ascii="Consolas" w:hAnsi="Consolas"/>
-          <w:sz w:val="20"/>
-          <w:szCs w:val="20"/>
-        </w:rPr>
-        <w:t>"</w:t>
-      </w:r>
-      <w:r>
-        <w:t xml:space="preserve"> | </w:t>
-      </w:r>
-      <w:r>
-        <w:rPr>
-          <w:rFonts w:ascii="Consolas" w:hAnsi="Consolas"/>
-          <w:sz w:val="20"/>
-          <w:szCs w:val="20"/>
-        </w:rPr>
-        <w:t>"</w:t>
-      </w:r>
-      <w:r>
-        <w:t>v</w:t>
-      </w:r>
-      <w:r>
-        <w:rPr>
-          <w:rFonts w:ascii="Consolas" w:hAnsi="Consolas"/>
-          <w:sz w:val="20"/>
-          <w:szCs w:val="20"/>
-        </w:rPr>
-        <w:t>"</w:t>
-      </w:r>
-      <w:r>
-        <w:t xml:space="preserve"> | </w:t>
-      </w:r>
-      <w:r>
-        <w:rPr>
-          <w:rFonts w:ascii="Consolas" w:hAnsi="Consolas"/>
-          <w:sz w:val="20"/>
-          <w:szCs w:val="20"/>
-        </w:rPr>
-        <w:t>"</w:t>
-      </w:r>
-      <w:r>
-        <w:t>w</w:t>
-      </w:r>
-      <w:r>
-        <w:rPr>
-          <w:rFonts w:ascii="Consolas" w:hAnsi="Consolas"/>
-          <w:sz w:val="20"/>
-          <w:szCs w:val="20"/>
-        </w:rPr>
-        <w:t>"</w:t>
-      </w:r>
-      <w:r>
-        <w:t xml:space="preserve"> | </w:t>
-      </w:r>
-      <w:r>
-        <w:rPr>
-          <w:rFonts w:ascii="Consolas" w:hAnsi="Consolas"/>
-          <w:sz w:val="20"/>
-          <w:szCs w:val="20"/>
-        </w:rPr>
-        <w:t>"</w:t>
-      </w:r>
-      <w:r>
-        <w:t>x</w:t>
-      </w:r>
-      <w:r>
-        <w:rPr>
-          <w:rFonts w:ascii="Consolas" w:hAnsi="Consolas"/>
-          <w:sz w:val="20"/>
-          <w:szCs w:val="20"/>
-        </w:rPr>
-        <w:t>"</w:t>
-      </w:r>
-      <w:r>
-        <w:t xml:space="preserve"> | </w:t>
-      </w:r>
-      <w:r>
-        <w:rPr>
-          <w:rFonts w:ascii="Consolas" w:hAnsi="Consolas"/>
-          <w:sz w:val="20"/>
-          <w:szCs w:val="20"/>
-        </w:rPr>
-        <w:t>"</w:t>
-      </w:r>
-      <w:r>
-        <w:t>y</w:t>
-      </w:r>
-      <w:r>
-        <w:rPr>
-          <w:rFonts w:ascii="Consolas" w:hAnsi="Consolas"/>
-          <w:sz w:val="20"/>
-          <w:szCs w:val="20"/>
-        </w:rPr>
-        <w:t>"</w:t>
-      </w:r>
-      <w:r>
-        <w:t xml:space="preserve"> | </w:t>
-      </w:r>
-      <w:r>
-        <w:rPr>
-          <w:rFonts w:ascii="Consolas" w:hAnsi="Consolas"/>
-          <w:sz w:val="20"/>
-          <w:szCs w:val="20"/>
-        </w:rPr>
-        <w:t>"</w:t>
-      </w:r>
-      <w:r>
-        <w:t>z</w:t>
-      </w:r>
-      <w:r>
-        <w:rPr>
-          <w:rFonts w:ascii="Consolas" w:hAnsi="Consolas"/>
-          <w:sz w:val="20"/>
-          <w:szCs w:val="20"/>
-        </w:rPr>
-        <w:t>"</w:t>
+        <w:t>{separator, folder};</w:t>
+      </w:r>
+    </w:p>
+    <w:p>
+      <w:pPr>
+        <w:ind w:left="864" w:hanging="864"/>
+      </w:pPr>
+      <w:r>
+        <w:t xml:space="preserve">  </w:t>
+      </w:r>
+      <w:r>
+        <w:t>separator = "\"</w:t>
       </w:r>
       <w:r>
         <w:t>;</w:t>
-      </w:r>
-    </w:p>
-    <w:p>
-      <w:pPr>
-        <w:ind w:left="864" w:hanging="864"/>
-      </w:pPr>
-      <w:r>
-        <w:t xml:space="preserve">  </w:t>
-      </w:r>
-      <w:r>
-        <w:t>folder = folder_char, [folder_char],</w:t>
-      </w:r>
-      <w:r>
-        <w:t xml:space="preserve"> [folder_char], [folder_char], [folder_char], [folder_char], [folder_char], [folder_char</w:t>
-      </w:r>
-      <w:r>
-        <w:t>];</w:t>
-      </w:r>
-    </w:p>
-    <w:p>
-      <w:pPr>
-        <w:ind w:left="864" w:hanging="864"/>
-      </w:pPr>
-      <w:r>
-        <w:t xml:space="preserve">  </w:t>
-      </w:r>
-      <w:r>
-        <w:t>folder_char = letter | digit;</w:t>
-      </w:r>
-    </w:p>
-    <w:p>
-      <w:pPr>
-        <w:ind w:left="864" w:hanging="864"/>
-      </w:pPr>
-      <w:r>
-        <w:t xml:space="preserve">  </w:t>
-      </w:r>
-      <w:r>
-        <w:t>digit = "0" | "1" | "2" | "3" | "4" | "5" | "6" | "7" | "8" | "9";</w:t>
-      </w:r>
-    </w:p>
-    <w:p>
-      <w:pPr>
-        <w:ind w:left="864" w:hanging="864"/>
-      </w:pPr>
-      <w:r>
-        <w:t xml:space="preserve">  </w:t>
-      </w:r>
-      <w:r>
-        <w:t>path = folder,</w:t>
-      </w:r>
-      <w:r>
-        <w:t xml:space="preserve"> </w:t>
-      </w:r>
-      <w:r>
-        <w:t>{separator, folder};</w:t>
-      </w:r>
-    </w:p>
-    <w:p>
-      <w:pPr>
-        <w:ind w:left="864" w:hanging="864"/>
-      </w:pPr>
-      <w:r>
-        <w:t xml:space="preserve">  </w:t>
-      </w:r>
-      <w:r>
-        <w:t>separator = "\"</w:t>
       </w:r>
     </w:p>
     <w:p>
@@ -2339,16 +1641,17 @@
     <w:p>
       <w:pPr>
         <w:ind w:left="864" w:hanging="864"/>
+        <w:jc w:val="center"/>
       </w:pPr>
       <w:r>
         <w:rPr>
           <w:noProof/>
         </w:rPr>
         <w:drawing>
-          <wp:inline distT="0" distB="0" distL="0" distR="0" wp14:anchorId="15808DD4" wp14:editId="15634F4E">
-            <wp:extent cx="5734050" cy="3733800"/>
+          <wp:inline distT="0" distB="0" distL="0" distR="0" wp14:anchorId="66390F39" wp14:editId="464078F5">
+            <wp:extent cx="3187700" cy="4102462"/>
             <wp:effectExtent l="0" t="0" r="0" b="0"/>
-            <wp:docPr id="841356295" name="Picture 1"/>
+            <wp:docPr id="554119386" name="Picture 1"/>
             <wp:cNvGraphicFramePr>
               <a:graphicFrameLocks xmlns:a="http://schemas.openxmlformats.org/drawingml/2006/main" noChangeAspect="1"/>
             </wp:cNvGraphicFramePr>
@@ -2356,7 +1659,7 @@
               <a:graphicData uri="http://schemas.openxmlformats.org/drawingml/2006/picture">
                 <pic:pic xmlns:pic="http://schemas.openxmlformats.org/drawingml/2006/picture">
                   <pic:nvPicPr>
-                    <pic:cNvPr id="841356295" name="Picture 841356295"/>
+                    <pic:cNvPr id="554119386" name="Picture 554119386"/>
                     <pic:cNvPicPr/>
                   </pic:nvPicPr>
                   <pic:blipFill>
@@ -2374,7 +1677,7 @@
                   <pic:spPr>
                     <a:xfrm>
                       <a:off x="0" y="0"/>
-                      <a:ext cx="5734050" cy="3733800"/>
+                      <a:ext cx="3210565" cy="4131889"/>
                     </a:xfrm>
                     <a:prstGeom prst="rect">
                       <a:avLst/>
@@ -3189,6 +2492,7 @@
   <w:style w:type="character" w:default="1" w:styleId="DefaultParagraphFont">
     <w:name w:val="Default Paragraph Font"/>
     <w:uiPriority w:val="1"/>
+    <w:semiHidden/>
     <w:unhideWhenUsed/>
   </w:style>
   <w:style w:type="table" w:default="1" w:styleId="TableNormal">

</xml_diff>